<commit_message>
Stage G: manual screenshots - mu-Clid MIDI, Support and About panels, clean modulator crops
Refs #1371: mu-Clid MIDI manual gets its 3 screenshots (whole window, transport bar, Euclidean panel), captured from the Release VST3 inside pluginval's editor tests
Refs #1351: mu-Clid Support and About panels (unlicensed look), mu-Tant About panel, clean mu-Clid and mu-Tant modulator crops; manuals regenerated
Refs #1293: the "still treat a bar" wording was already fixed; Clock-locked transport bar and Clock lamp captures still need a MIDI clock source (none on this PC)

Version: v1.1.0.1408

Co-Authored-By: Claude Sonnet 5.5 <noreply@anthropic.com>
</commit_message>
<xml_diff>
--- a/docs/mu-clid-midi/mu-Clid MIDI User Manual.docx
+++ b/docs/mu-clid-midi/mu-Clid MIDI User Manual.docx
@@ -43,6 +43,7 @@
         <w:pStyle w:val="Heading1"/>
       </w:pPr>
       <w:r>
+        <w:lastRenderedPageBreak/>
         <w:t>1. Introduction</w:t>
       </w:r>
     </w:p>
@@ -64,6 +65,57 @@
     <w:p>
       <w:r>
         <w:t>It plays one rhythm. For up to eight rhythms, each with its own sample and synth voice, mixer and effects, see mu-Clid. The two use the same Euclidean engine, so a rhythm sounds the same pattern in either.</w:t>
+      </w:r>
+    </w:p>
+    <w:p>
+      <w:pPr>
+        <w:jc w:val="center"/>
+      </w:pPr>
+      <w:r>
+        <w:rPr>
+          <w:noProof/>
+        </w:rPr>
+        <w:drawing>
+          <wp:inline distT="0" distB="0" distL="0" distR="0" wp14:anchorId="7634BFDF" wp14:editId="2C69A10E">
+            <wp:extent cx="5274310" cy="1995805"/>
+            <wp:effectExtent l="0" t="0" r="2540" b="4445"/>
+            <wp:docPr id="287840568" name="Picture 1"/>
+            <wp:cNvGraphicFramePr>
+              <a:graphicFrameLocks xmlns:a="http://schemas.openxmlformats.org/drawingml/2006/main" noChangeAspect="1"/>
+            </wp:cNvGraphicFramePr>
+            <a:graphic xmlns:a="http://schemas.openxmlformats.org/drawingml/2006/main">
+              <a:graphicData uri="http://schemas.openxmlformats.org/drawingml/2006/picture">
+                <pic:pic xmlns:pic="http://schemas.openxmlformats.org/drawingml/2006/picture">
+                  <pic:nvPicPr>
+                    <pic:cNvPr id="287840568" name=""/>
+                    <pic:cNvPicPr/>
+                  </pic:nvPicPr>
+                  <pic:blipFill>
+                    <a:blip r:embed="rId5">
+                      <a:extLst>
+                        <a:ext uri="{28A0092B-C50C-407E-A947-70E740481C1C}">
+                          <a14:useLocalDpi xmlns:a14="http://schemas.microsoft.com/office/drawing/2010/main" val="0"/>
+                        </a:ext>
+                      </a:extLst>
+                    </a:blip>
+                    <a:stretch>
+                      <a:fillRect/>
+                    </a:stretch>
+                  </pic:blipFill>
+                  <pic:spPr>
+                    <a:xfrm>
+                      <a:off x="0" y="0"/>
+                      <a:ext cx="5274310" cy="1995805"/>
+                    </a:xfrm>
+                    <a:prstGeom prst="rect">
+                      <a:avLst/>
+                    </a:prstGeom>
+                  </pic:spPr>
+                </pic:pic>
+              </a:graphicData>
+            </a:graphic>
+          </wp:inline>
+        </w:drawing>
       </w:r>
     </w:p>
     <w:p>
@@ -71,7 +123,7 @@
         <w:rPr>
           <w:i/>
         </w:rPr>
-        <w:t>[Screenshot: The mu-Clid MIDI window: transport bar, rhythm circle, Euclidean panel and the Accent, MIDI Note and Logic controls.]</w:t>
+        <w:t>The mu-Clid MIDI window: transport bar, rhythm circle, Euclidean panel and the Accent, MIDI Note and Logic controls.</w:t>
       </w:r>
     </w:p>
     <w:p>
@@ -94,7 +146,11 @@
     </w:p>
     <w:p>
       <w:r>
-        <w:t>mu-Clid MIDI gives the rhythm three independent Euclidean generators and combines them with logic: OR for layered patterns, AND for sparse coincidences, XOR for interlocking rhythms. Add rotation (shifting the pattern to start on a different step), padding (forcing silence at the start, end or middle) and an accent layer, and a few simple controls give you a vast range of grooves.</w:t>
+        <w:t xml:space="preserve">mu-Clid MIDI gives the rhythm three independent Euclidean generators and combines them with logic: OR for layered patterns, AND for sparse coincidences, XOR for </w:t>
+      </w:r>
+      <w:r>
+        <w:lastRenderedPageBreak/>
+        <w:t>interlocking rhythms. Add rotation (shifting the pattern to start on a different step), padding (forcing silence at the start, end or middle) and an accent layer, and a few simple controls give you a vast range of grooves.</w:t>
       </w:r>
     </w:p>
     <w:p>
@@ -216,6 +272,57 @@
       </w:pPr>
       <w:r>
         <w:t>Loop dropdown  —  the master loop: how many steps the entire pattern runs before it starts again. Choices are the infinity symbol (free-running) or 16 to 256 steps in steps of 16. A counter beside it shows the current step and the loop length.</w:t>
+      </w:r>
+    </w:p>
+    <w:p>
+      <w:pPr>
+        <w:jc w:val="center"/>
+      </w:pPr>
+      <w:r>
+        <w:rPr>
+          <w:noProof/>
+        </w:rPr>
+        <w:drawing>
+          <wp:inline distT="0" distB="0" distL="0" distR="0" wp14:anchorId="7F0D4182" wp14:editId="078650B8">
+            <wp:extent cx="5274310" cy="189865"/>
+            <wp:effectExtent l="0" t="0" r="2540" b="635"/>
+            <wp:docPr id="1687764091" name="Picture 2"/>
+            <wp:cNvGraphicFramePr>
+              <a:graphicFrameLocks xmlns:a="http://schemas.openxmlformats.org/drawingml/2006/main" noChangeAspect="1"/>
+            </wp:cNvGraphicFramePr>
+            <a:graphic xmlns:a="http://schemas.openxmlformats.org/drawingml/2006/main">
+              <a:graphicData uri="http://schemas.openxmlformats.org/drawingml/2006/picture">
+                <pic:pic xmlns:pic="http://schemas.openxmlformats.org/drawingml/2006/picture">
+                  <pic:nvPicPr>
+                    <pic:cNvPr id="1687764091" name=""/>
+                    <pic:cNvPicPr/>
+                  </pic:nvPicPr>
+                  <pic:blipFill>
+                    <a:blip r:embed="rId6">
+                      <a:extLst>
+                        <a:ext uri="{28A0092B-C50C-407E-A947-70E740481C1C}">
+                          <a14:useLocalDpi xmlns:a14="http://schemas.microsoft.com/office/drawing/2010/main" val="0"/>
+                        </a:ext>
+                      </a:extLst>
+                    </a:blip>
+                    <a:stretch>
+                      <a:fillRect/>
+                    </a:stretch>
+                  </pic:blipFill>
+                  <pic:spPr>
+                    <a:xfrm>
+                      <a:off x="0" y="0"/>
+                      <a:ext cx="5274310" cy="189865"/>
+                    </a:xfrm>
+                    <a:prstGeom prst="rect">
+                      <a:avLst/>
+                    </a:prstGeom>
+                  </pic:spPr>
+                </pic:pic>
+              </a:graphicData>
+            </a:graphic>
+          </wp:inline>
+        </w:drawing>
       </w:r>
     </w:p>
     <w:p>
@@ -223,7 +330,7 @@
         <w:rPr>
           <w:i/>
         </w:rPr>
-        <w:t>[Screenshot: Transport bar.]</w:t>
+        <w:t>Transport bar.</w:t>
       </w:r>
     </w:p>
     <w:p>
@@ -231,6 +338,7 @@
         <w:pStyle w:val="Heading2"/>
       </w:pPr>
       <w:r>
+        <w:lastRenderedPageBreak/>
         <w:t>Rhythm Circle</w:t>
       </w:r>
     </w:p>
@@ -493,12 +601,64 @@
         <w:pStyle w:val="Heading2"/>
       </w:pPr>
       <w:r>
+        <w:lastRenderedPageBreak/>
         <w:t>Accent Layer</w:t>
       </w:r>
     </w:p>
     <w:p>
       <w:r>
         <w:t>The Accent row has no logic relationship with A or B. When the accent ring fires on the same step as a combined A and B hit, that hit is accented, and is sent with a higher velocity (see MIDI Output).</w:t>
+      </w:r>
+    </w:p>
+    <w:p>
+      <w:pPr>
+        <w:jc w:val="center"/>
+      </w:pPr>
+      <w:r>
+        <w:rPr>
+          <w:noProof/>
+        </w:rPr>
+        <w:drawing>
+          <wp:inline distT="0" distB="0" distL="0" distR="0" wp14:anchorId="31D1532D" wp14:editId="7C323DF8">
+            <wp:extent cx="5274310" cy="1710690"/>
+            <wp:effectExtent l="0" t="0" r="2540" b="3810"/>
+            <wp:docPr id="675891211" name="Picture 3"/>
+            <wp:cNvGraphicFramePr>
+              <a:graphicFrameLocks xmlns:a="http://schemas.openxmlformats.org/drawingml/2006/main" noChangeAspect="1"/>
+            </wp:cNvGraphicFramePr>
+            <a:graphic xmlns:a="http://schemas.openxmlformats.org/drawingml/2006/main">
+              <a:graphicData uri="http://schemas.openxmlformats.org/drawingml/2006/picture">
+                <pic:pic xmlns:pic="http://schemas.openxmlformats.org/drawingml/2006/picture">
+                  <pic:nvPicPr>
+                    <pic:cNvPr id="675891211" name=""/>
+                    <pic:cNvPicPr/>
+                  </pic:nvPicPr>
+                  <pic:blipFill>
+                    <a:blip r:embed="rId7">
+                      <a:extLst>
+                        <a:ext uri="{28A0092B-C50C-407E-A947-70E740481C1C}">
+                          <a14:useLocalDpi xmlns:a14="http://schemas.microsoft.com/office/drawing/2010/main" val="0"/>
+                        </a:ext>
+                      </a:extLst>
+                    </a:blip>
+                    <a:stretch>
+                      <a:fillRect/>
+                    </a:stretch>
+                  </pic:blipFill>
+                  <pic:spPr>
+                    <a:xfrm>
+                      <a:off x="0" y="0"/>
+                      <a:ext cx="5274310" cy="1710690"/>
+                    </a:xfrm>
+                    <a:prstGeom prst="rect">
+                      <a:avLst/>
+                    </a:prstGeom>
+                  </pic:spPr>
+                </pic:pic>
+              </a:graphicData>
+            </a:graphic>
+          </wp:inline>
+        </w:drawing>
       </w:r>
     </w:p>
     <w:p>
@@ -506,7 +666,7 @@
         <w:rPr>
           <w:i/>
         </w:rPr>
-        <w:t>[Screenshot: The Euclidean panel with its three rows.]</w:t>
+        <w:t>The Euclidean panel with its three rows.</w:t>
       </w:r>
     </w:p>
     <w:p>
@@ -638,7 +798,7 @@
   <w:abstractNum w:abstractNumId="0" w15:restartNumberingAfterBreak="0">
     <w:nsid w:val="FFFFFF89"/>
     <w:multiLevelType w:val="singleLevel"/>
-    <w:tmpl w:val="065E8AA8"/>
+    <w:tmpl w:val="3F2CC5E0"/>
     <w:lvl w:ilvl="0">
       <w:start w:val="1"/>
       <w:numFmt w:val="bullet"/>
@@ -656,7 +816,7 @@
       </w:rPr>
     </w:lvl>
   </w:abstractNum>
-  <w:num w:numId="1" w16cid:durableId="1843811850">
+  <w:num w:numId="1" w16cid:durableId="1092580984">
     <w:abstractNumId w:val="0"/>
   </w:num>
 </w:numbering>
@@ -1070,7 +1230,7 @@
     <w:link w:val="Heading1Char"/>
     <w:uiPriority w:val="9"/>
     <w:qFormat/>
-    <w:rsid w:val="005E15FF"/>
+    <w:rsid w:val="003F6190"/>
     <w:pPr>
       <w:keepNext/>
       <w:keepLines/>
@@ -1092,7 +1252,7 @@
     <w:uiPriority w:val="9"/>
     <w:unhideWhenUsed/>
     <w:qFormat/>
-    <w:rsid w:val="005E15FF"/>
+    <w:rsid w:val="003F6190"/>
     <w:pPr>
       <w:keepNext/>
       <w:keepLines/>
@@ -1115,7 +1275,7 @@
     <w:semiHidden/>
     <w:unhideWhenUsed/>
     <w:qFormat/>
-    <w:rsid w:val="005E15FF"/>
+    <w:rsid w:val="003F6190"/>
     <w:pPr>
       <w:keepNext/>
       <w:keepLines/>
@@ -1138,7 +1298,7 @@
     <w:semiHidden/>
     <w:unhideWhenUsed/>
     <w:qFormat/>
-    <w:rsid w:val="005E15FF"/>
+    <w:rsid w:val="003F6190"/>
     <w:pPr>
       <w:keepNext/>
       <w:keepLines/>
@@ -1161,7 +1321,7 @@
     <w:semiHidden/>
     <w:unhideWhenUsed/>
     <w:qFormat/>
-    <w:rsid w:val="005E15FF"/>
+    <w:rsid w:val="003F6190"/>
     <w:pPr>
       <w:keepNext/>
       <w:keepLines/>
@@ -1182,7 +1342,7 @@
     <w:semiHidden/>
     <w:unhideWhenUsed/>
     <w:qFormat/>
-    <w:rsid w:val="005E15FF"/>
+    <w:rsid w:val="003F6190"/>
     <w:pPr>
       <w:keepNext/>
       <w:keepLines/>
@@ -1205,7 +1365,7 @@
     <w:semiHidden/>
     <w:unhideWhenUsed/>
     <w:qFormat/>
-    <w:rsid w:val="005E15FF"/>
+    <w:rsid w:val="003F6190"/>
     <w:pPr>
       <w:keepNext/>
       <w:keepLines/>
@@ -1226,7 +1386,7 @@
     <w:semiHidden/>
     <w:unhideWhenUsed/>
     <w:qFormat/>
-    <w:rsid w:val="005E15FF"/>
+    <w:rsid w:val="003F6190"/>
     <w:pPr>
       <w:keepNext/>
       <w:keepLines/>
@@ -1249,7 +1409,7 @@
     <w:semiHidden/>
     <w:unhideWhenUsed/>
     <w:qFormat/>
-    <w:rsid w:val="005E15FF"/>
+    <w:rsid w:val="003F6190"/>
     <w:pPr>
       <w:keepNext/>
       <w:keepLines/>
@@ -1293,7 +1453,7 @@
     <w:basedOn w:val="DefaultParagraphFont"/>
     <w:link w:val="Heading1"/>
     <w:uiPriority w:val="9"/>
-    <w:rsid w:val="005E15FF"/>
+    <w:rsid w:val="003F6190"/>
     <w:rPr>
       <w:rFonts w:asciiTheme="majorHAnsi" w:eastAsiaTheme="majorEastAsia" w:hAnsiTheme="majorHAnsi" w:cstheme="majorBidi"/>
       <w:color w:val="0F4761" w:themeColor="accent1" w:themeShade="BF"/>
@@ -1306,7 +1466,7 @@
     <w:basedOn w:val="DefaultParagraphFont"/>
     <w:link w:val="Heading2"/>
     <w:uiPriority w:val="9"/>
-    <w:rsid w:val="005E15FF"/>
+    <w:rsid w:val="003F6190"/>
     <w:rPr>
       <w:rFonts w:asciiTheme="majorHAnsi" w:eastAsiaTheme="majorEastAsia" w:hAnsiTheme="majorHAnsi" w:cstheme="majorBidi"/>
       <w:color w:val="0F4761" w:themeColor="accent1" w:themeShade="BF"/>
@@ -1320,7 +1480,7 @@
     <w:link w:val="Heading3"/>
     <w:uiPriority w:val="9"/>
     <w:semiHidden/>
-    <w:rsid w:val="005E15FF"/>
+    <w:rsid w:val="003F6190"/>
     <w:rPr>
       <w:rFonts w:eastAsiaTheme="majorEastAsia" w:cstheme="majorBidi"/>
       <w:color w:val="0F4761" w:themeColor="accent1" w:themeShade="BF"/>
@@ -1334,7 +1494,7 @@
     <w:link w:val="Heading4"/>
     <w:uiPriority w:val="9"/>
     <w:semiHidden/>
-    <w:rsid w:val="005E15FF"/>
+    <w:rsid w:val="003F6190"/>
     <w:rPr>
       <w:rFonts w:eastAsiaTheme="majorEastAsia" w:cstheme="majorBidi"/>
       <w:i/>
@@ -1348,7 +1508,7 @@
     <w:link w:val="Heading5"/>
     <w:uiPriority w:val="9"/>
     <w:semiHidden/>
-    <w:rsid w:val="005E15FF"/>
+    <w:rsid w:val="003F6190"/>
     <w:rPr>
       <w:rFonts w:eastAsiaTheme="majorEastAsia" w:cstheme="majorBidi"/>
       <w:color w:val="0F4761" w:themeColor="accent1" w:themeShade="BF"/>
@@ -1360,7 +1520,7 @@
     <w:link w:val="Heading6"/>
     <w:uiPriority w:val="9"/>
     <w:semiHidden/>
-    <w:rsid w:val="005E15FF"/>
+    <w:rsid w:val="003F6190"/>
     <w:rPr>
       <w:rFonts w:eastAsiaTheme="majorEastAsia" w:cstheme="majorBidi"/>
       <w:i/>
@@ -1374,7 +1534,7 @@
     <w:link w:val="Heading7"/>
     <w:uiPriority w:val="9"/>
     <w:semiHidden/>
-    <w:rsid w:val="005E15FF"/>
+    <w:rsid w:val="003F6190"/>
     <w:rPr>
       <w:rFonts w:eastAsiaTheme="majorEastAsia" w:cstheme="majorBidi"/>
       <w:color w:val="595959" w:themeColor="text1" w:themeTint="A6"/>
@@ -1386,7 +1546,7 @@
     <w:link w:val="Heading8"/>
     <w:uiPriority w:val="9"/>
     <w:semiHidden/>
-    <w:rsid w:val="005E15FF"/>
+    <w:rsid w:val="003F6190"/>
     <w:rPr>
       <w:rFonts w:eastAsiaTheme="majorEastAsia" w:cstheme="majorBidi"/>
       <w:i/>
@@ -1400,7 +1560,7 @@
     <w:link w:val="Heading9"/>
     <w:uiPriority w:val="9"/>
     <w:semiHidden/>
-    <w:rsid w:val="005E15FF"/>
+    <w:rsid w:val="003F6190"/>
     <w:rPr>
       <w:rFonts w:eastAsiaTheme="majorEastAsia" w:cstheme="majorBidi"/>
       <w:color w:val="272727" w:themeColor="text1" w:themeTint="D8"/>
@@ -1413,7 +1573,7 @@
     <w:link w:val="TitleChar"/>
     <w:uiPriority w:val="10"/>
     <w:qFormat/>
-    <w:rsid w:val="005E15FF"/>
+    <w:rsid w:val="003F6190"/>
     <w:pPr>
       <w:spacing w:after="80" w:line="240" w:lineRule="auto"/>
       <w:contextualSpacing/>
@@ -1431,7 +1591,7 @@
     <w:basedOn w:val="DefaultParagraphFont"/>
     <w:link w:val="Title"/>
     <w:uiPriority w:val="10"/>
-    <w:rsid w:val="005E15FF"/>
+    <w:rsid w:val="003F6190"/>
     <w:rPr>
       <w:rFonts w:asciiTheme="majorHAnsi" w:eastAsiaTheme="majorEastAsia" w:hAnsiTheme="majorHAnsi" w:cstheme="majorBidi"/>
       <w:spacing w:val="-10"/>
@@ -1447,7 +1607,7 @@
     <w:link w:val="SubtitleChar"/>
     <w:uiPriority w:val="11"/>
     <w:qFormat/>
-    <w:rsid w:val="005E15FF"/>
+    <w:rsid w:val="003F6190"/>
     <w:pPr>
       <w:numPr>
         <w:ilvl w:val="1"/>
@@ -1466,7 +1626,7 @@
     <w:basedOn w:val="DefaultParagraphFont"/>
     <w:link w:val="Subtitle"/>
     <w:uiPriority w:val="11"/>
-    <w:rsid w:val="005E15FF"/>
+    <w:rsid w:val="003F6190"/>
     <w:rPr>
       <w:rFonts w:eastAsiaTheme="majorEastAsia" w:cstheme="majorBidi"/>
       <w:color w:val="595959" w:themeColor="text1" w:themeTint="A6"/>
@@ -1482,7 +1642,7 @@
     <w:link w:val="QuoteChar"/>
     <w:uiPriority w:val="29"/>
     <w:qFormat/>
-    <w:rsid w:val="005E15FF"/>
+    <w:rsid w:val="003F6190"/>
     <w:pPr>
       <w:spacing w:before="160"/>
       <w:jc w:val="center"/>
@@ -1498,7 +1658,7 @@
     <w:basedOn w:val="DefaultParagraphFont"/>
     <w:link w:val="Quote"/>
     <w:uiPriority w:val="29"/>
-    <w:rsid w:val="005E15FF"/>
+    <w:rsid w:val="003F6190"/>
     <w:rPr>
       <w:i/>
       <w:iCs/>
@@ -1510,7 +1670,7 @@
     <w:basedOn w:val="Normal"/>
     <w:uiPriority w:val="34"/>
     <w:qFormat/>
-    <w:rsid w:val="005E15FF"/>
+    <w:rsid w:val="003F6190"/>
     <w:pPr>
       <w:ind w:left="720"/>
       <w:contextualSpacing/>
@@ -1521,7 +1681,7 @@
     <w:basedOn w:val="DefaultParagraphFont"/>
     <w:uiPriority w:val="21"/>
     <w:qFormat/>
-    <w:rsid w:val="005E15FF"/>
+    <w:rsid w:val="003F6190"/>
     <w:rPr>
       <w:i/>
       <w:iCs/>
@@ -1535,7 +1695,7 @@
     <w:link w:val="IntenseQuoteChar"/>
     <w:uiPriority w:val="30"/>
     <w:qFormat/>
-    <w:rsid w:val="005E15FF"/>
+    <w:rsid w:val="003F6190"/>
     <w:pPr>
       <w:pBdr>
         <w:top w:val="single" w:sz="4" w:space="10" w:color="0F4761" w:themeColor="accent1" w:themeShade="BF"/>
@@ -1556,7 +1716,7 @@
     <w:basedOn w:val="DefaultParagraphFont"/>
     <w:link w:val="IntenseQuote"/>
     <w:uiPriority w:val="30"/>
-    <w:rsid w:val="005E15FF"/>
+    <w:rsid w:val="003F6190"/>
     <w:rPr>
       <w:i/>
       <w:iCs/>
@@ -1568,7 +1728,7 @@
     <w:basedOn w:val="DefaultParagraphFont"/>
     <w:uiPriority w:val="32"/>
     <w:qFormat/>
-    <w:rsid w:val="005E15FF"/>
+    <w:rsid w:val="003F6190"/>
     <w:rPr>
       <w:b/>
       <w:bCs/>
@@ -1582,7 +1742,7 @@
     <w:basedOn w:val="Normal"/>
     <w:uiPriority w:val="99"/>
     <w:unhideWhenUsed/>
-    <w:rsid w:val="005E15FF"/>
+    <w:rsid w:val="003F6190"/>
     <w:pPr>
       <w:numPr>
         <w:numId w:val="1"/>

</xml_diff>

<commit_message>
Manuals: Update Check section for mu-Clid MIDI and mu-Link; IP address sentence in all six; regenerated
Co-Authored-By: Claude Sonnet 5.5 <noreply@anthropic.com>
</commit_message>
<xml_diff>
--- a/docs/mu-clid-midi/mu-Clid MIDI User Manual.docx
+++ b/docs/mu-clid-midi/mu-Clid MIDI User Manual.docx
@@ -76,10 +76,10 @@
           <w:noProof/>
         </w:rPr>
         <w:drawing>
-          <wp:inline distT="0" distB="0" distL="0" distR="0" wp14:anchorId="7634BFDF" wp14:editId="2C69A10E">
+          <wp:inline distT="0" distB="0" distL="0" distR="0" wp14:anchorId="129A3983" wp14:editId="540A43C6">
             <wp:extent cx="5274310" cy="1995805"/>
             <wp:effectExtent l="0" t="0" r="2540" b="4445"/>
-            <wp:docPr id="287840568" name="Picture 1"/>
+            <wp:docPr id="1492215828" name="Picture 1"/>
             <wp:cNvGraphicFramePr>
               <a:graphicFrameLocks xmlns:a="http://schemas.openxmlformats.org/drawingml/2006/main" noChangeAspect="1"/>
             </wp:cNvGraphicFramePr>
@@ -87,7 +87,7 @@
               <a:graphicData uri="http://schemas.openxmlformats.org/drawingml/2006/picture">
                 <pic:pic xmlns:pic="http://schemas.openxmlformats.org/drawingml/2006/picture">
                   <pic:nvPicPr>
-                    <pic:cNvPr id="287840568" name=""/>
+                    <pic:cNvPr id="1492215828" name=""/>
                     <pic:cNvPicPr/>
                   </pic:nvPicPr>
                   <pic:blipFill>
@@ -283,10 +283,10 @@
           <w:noProof/>
         </w:rPr>
         <w:drawing>
-          <wp:inline distT="0" distB="0" distL="0" distR="0" wp14:anchorId="7F0D4182" wp14:editId="078650B8">
+          <wp:inline distT="0" distB="0" distL="0" distR="0" wp14:anchorId="6A9082D3" wp14:editId="151DED23">
             <wp:extent cx="5274310" cy="189865"/>
             <wp:effectExtent l="0" t="0" r="2540" b="635"/>
-            <wp:docPr id="1687764091" name="Picture 2"/>
+            <wp:docPr id="720026439" name="Picture 2"/>
             <wp:cNvGraphicFramePr>
               <a:graphicFrameLocks xmlns:a="http://schemas.openxmlformats.org/drawingml/2006/main" noChangeAspect="1"/>
             </wp:cNvGraphicFramePr>
@@ -294,7 +294,7 @@
               <a:graphicData uri="http://schemas.openxmlformats.org/drawingml/2006/picture">
                 <pic:pic xmlns:pic="http://schemas.openxmlformats.org/drawingml/2006/picture">
                   <pic:nvPicPr>
-                    <pic:cNvPr id="1687764091" name=""/>
+                    <pic:cNvPr id="720026439" name=""/>
                     <pic:cNvPicPr/>
                   </pic:nvPicPr>
                   <pic:blipFill>
@@ -349,6 +349,40 @@
     </w:p>
     <w:p>
       <w:pPr>
+        <w:pStyle w:val="Heading2"/>
+      </w:pPr>
+      <w:r>
+        <w:t>Update Check</w:t>
+      </w:r>
+    </w:p>
+    <w:p>
+      <w:r>
+        <w:t>mu-Clid MIDI can tell you when a newer version is available. Once a day it asks the transwarp.me website for the latest version number. When a newer version exists, a small Update available link appears at the right of the Status Bar. Hover over it to see which version is out and which one you have.</w:t>
+      </w:r>
+    </w:p>
+    <w:p>
+      <w:pPr>
+        <w:pStyle w:val="ListBullet"/>
+      </w:pPr>
+      <w:r>
+        <w:t>Click the link to open the download page in your web browser. mu-Clid MIDI never downloads or installs anything itself. The link then stays hidden for that version and comes back only when a still newer one is released.</w:t>
+      </w:r>
+    </w:p>
+    <w:p>
+      <w:pPr>
+        <w:pStyle w:val="ListBullet"/>
+      </w:pPr>
+      <w:r>
+        <w:t>Right-click the link and choose Hide this notice to hide it for that version without opening the page.</w:t>
+      </w:r>
+    </w:p>
+    <w:p>
+      <w:r>
+        <w:t>Privacy: the check is a plain request for a public file. It sends nothing about you: no name, no identifier, no version number and no details of your computer. As with any request to a website, the site can see your internet (IP) address, as it would if you opened the page in a browser. The plug-in compares the answer with its own version on your machine. To switch the check off, click the mu-Clid MIDI logo to open the About card and untick the Check for updates box. With the box unticked, mu-Clid MIDI sends no request at all and shows no link. The box is ticked by default.</w:t>
+      </w:r>
+    </w:p>
+    <w:p>
+      <w:pPr>
         <w:pStyle w:val="Heading1"/>
       </w:pPr>
       <w:r>
@@ -433,6 +467,7 @@
     </w:p>
     <w:p>
       <w:r>
+        <w:lastRenderedPageBreak/>
         <w:t>What the Pad | Mute switch does: in Pad mode the silent steps are taken out of the pattern, and all the hits are spread over the steps that remain. In Mute mode the pattern stays spread over every step, and any hits that land in the silent steps are silenced. The Status Bar spells out the current setting when you flip a switch.</w:t>
       </w:r>
     </w:p>
@@ -601,7 +636,6 @@
         <w:pStyle w:val="Heading2"/>
       </w:pPr>
       <w:r>
-        <w:lastRenderedPageBreak/>
         <w:t>Accent Layer</w:t>
       </w:r>
     </w:p>
@@ -619,10 +653,10 @@
           <w:noProof/>
         </w:rPr>
         <w:drawing>
-          <wp:inline distT="0" distB="0" distL="0" distR="0" wp14:anchorId="31D1532D" wp14:editId="7C323DF8">
+          <wp:inline distT="0" distB="0" distL="0" distR="0" wp14:anchorId="6E20B577" wp14:editId="49745FB4">
             <wp:extent cx="5274310" cy="1710690"/>
             <wp:effectExtent l="0" t="0" r="2540" b="3810"/>
-            <wp:docPr id="675891211" name="Picture 3"/>
+            <wp:docPr id="2054314169" name="Picture 3"/>
             <wp:cNvGraphicFramePr>
               <a:graphicFrameLocks xmlns:a="http://schemas.openxmlformats.org/drawingml/2006/main" noChangeAspect="1"/>
             </wp:cNvGraphicFramePr>
@@ -630,7 +664,7 @@
               <a:graphicData uri="http://schemas.openxmlformats.org/drawingml/2006/picture">
                 <pic:pic xmlns:pic="http://schemas.openxmlformats.org/drawingml/2006/picture">
                   <pic:nvPicPr>
-                    <pic:cNvPr id="675891211" name=""/>
+                    <pic:cNvPr id="2054314169" name=""/>
                     <pic:cNvPicPr/>
                   </pic:nvPicPr>
                   <pic:blipFill>
@@ -700,6 +734,7 @@
     </w:p>
     <w:p>
       <w:r>
+        <w:lastRenderedPageBreak/>
         <w:t>Each note lasts about 20 milliseconds, which suits drums and plucks. Synths with a long release will ring on after the note ends; set the release in the instrument. mu-Clid MIDI never leaves a note hanging: if you bypass the plug-in while a note is sounding, its note-off is still sent.</w:t>
       </w:r>
     </w:p>
@@ -798,7 +833,7 @@
   <w:abstractNum w:abstractNumId="0" w15:restartNumberingAfterBreak="0">
     <w:nsid w:val="FFFFFF89"/>
     <w:multiLevelType w:val="singleLevel"/>
-    <w:tmpl w:val="3F2CC5E0"/>
+    <w:tmpl w:val="0F3AA17A"/>
     <w:lvl w:ilvl="0">
       <w:start w:val="1"/>
       <w:numFmt w:val="bullet"/>
@@ -816,7 +851,7 @@
       </w:rPr>
     </w:lvl>
   </w:abstractNum>
-  <w:num w:numId="1" w16cid:durableId="1092580984">
+  <w:num w:numId="1" w16cid:durableId="500782202">
     <w:abstractNumId w:val="0"/>
   </w:num>
 </w:numbering>
@@ -1230,7 +1265,7 @@
     <w:link w:val="Heading1Char"/>
     <w:uiPriority w:val="9"/>
     <w:qFormat/>
-    <w:rsid w:val="003F6190"/>
+    <w:rsid w:val="00345911"/>
     <w:pPr>
       <w:keepNext/>
       <w:keepLines/>
@@ -1252,7 +1287,7 @@
     <w:uiPriority w:val="9"/>
     <w:unhideWhenUsed/>
     <w:qFormat/>
-    <w:rsid w:val="003F6190"/>
+    <w:rsid w:val="00345911"/>
     <w:pPr>
       <w:keepNext/>
       <w:keepLines/>
@@ -1275,7 +1310,7 @@
     <w:semiHidden/>
     <w:unhideWhenUsed/>
     <w:qFormat/>
-    <w:rsid w:val="003F6190"/>
+    <w:rsid w:val="00345911"/>
     <w:pPr>
       <w:keepNext/>
       <w:keepLines/>
@@ -1298,7 +1333,7 @@
     <w:semiHidden/>
     <w:unhideWhenUsed/>
     <w:qFormat/>
-    <w:rsid w:val="003F6190"/>
+    <w:rsid w:val="00345911"/>
     <w:pPr>
       <w:keepNext/>
       <w:keepLines/>
@@ -1321,7 +1356,7 @@
     <w:semiHidden/>
     <w:unhideWhenUsed/>
     <w:qFormat/>
-    <w:rsid w:val="003F6190"/>
+    <w:rsid w:val="00345911"/>
     <w:pPr>
       <w:keepNext/>
       <w:keepLines/>
@@ -1342,7 +1377,7 @@
     <w:semiHidden/>
     <w:unhideWhenUsed/>
     <w:qFormat/>
-    <w:rsid w:val="003F6190"/>
+    <w:rsid w:val="00345911"/>
     <w:pPr>
       <w:keepNext/>
       <w:keepLines/>
@@ -1365,7 +1400,7 @@
     <w:semiHidden/>
     <w:unhideWhenUsed/>
     <w:qFormat/>
-    <w:rsid w:val="003F6190"/>
+    <w:rsid w:val="00345911"/>
     <w:pPr>
       <w:keepNext/>
       <w:keepLines/>
@@ -1386,7 +1421,7 @@
     <w:semiHidden/>
     <w:unhideWhenUsed/>
     <w:qFormat/>
-    <w:rsid w:val="003F6190"/>
+    <w:rsid w:val="00345911"/>
     <w:pPr>
       <w:keepNext/>
       <w:keepLines/>
@@ -1409,7 +1444,7 @@
     <w:semiHidden/>
     <w:unhideWhenUsed/>
     <w:qFormat/>
-    <w:rsid w:val="003F6190"/>
+    <w:rsid w:val="00345911"/>
     <w:pPr>
       <w:keepNext/>
       <w:keepLines/>
@@ -1453,7 +1488,7 @@
     <w:basedOn w:val="DefaultParagraphFont"/>
     <w:link w:val="Heading1"/>
     <w:uiPriority w:val="9"/>
-    <w:rsid w:val="003F6190"/>
+    <w:rsid w:val="00345911"/>
     <w:rPr>
       <w:rFonts w:asciiTheme="majorHAnsi" w:eastAsiaTheme="majorEastAsia" w:hAnsiTheme="majorHAnsi" w:cstheme="majorBidi"/>
       <w:color w:val="0F4761" w:themeColor="accent1" w:themeShade="BF"/>
@@ -1466,7 +1501,7 @@
     <w:basedOn w:val="DefaultParagraphFont"/>
     <w:link w:val="Heading2"/>
     <w:uiPriority w:val="9"/>
-    <w:rsid w:val="003F6190"/>
+    <w:rsid w:val="00345911"/>
     <w:rPr>
       <w:rFonts w:asciiTheme="majorHAnsi" w:eastAsiaTheme="majorEastAsia" w:hAnsiTheme="majorHAnsi" w:cstheme="majorBidi"/>
       <w:color w:val="0F4761" w:themeColor="accent1" w:themeShade="BF"/>
@@ -1480,7 +1515,7 @@
     <w:link w:val="Heading3"/>
     <w:uiPriority w:val="9"/>
     <w:semiHidden/>
-    <w:rsid w:val="003F6190"/>
+    <w:rsid w:val="00345911"/>
     <w:rPr>
       <w:rFonts w:eastAsiaTheme="majorEastAsia" w:cstheme="majorBidi"/>
       <w:color w:val="0F4761" w:themeColor="accent1" w:themeShade="BF"/>
@@ -1494,7 +1529,7 @@
     <w:link w:val="Heading4"/>
     <w:uiPriority w:val="9"/>
     <w:semiHidden/>
-    <w:rsid w:val="003F6190"/>
+    <w:rsid w:val="00345911"/>
     <w:rPr>
       <w:rFonts w:eastAsiaTheme="majorEastAsia" w:cstheme="majorBidi"/>
       <w:i/>
@@ -1508,7 +1543,7 @@
     <w:link w:val="Heading5"/>
     <w:uiPriority w:val="9"/>
     <w:semiHidden/>
-    <w:rsid w:val="003F6190"/>
+    <w:rsid w:val="00345911"/>
     <w:rPr>
       <w:rFonts w:eastAsiaTheme="majorEastAsia" w:cstheme="majorBidi"/>
       <w:color w:val="0F4761" w:themeColor="accent1" w:themeShade="BF"/>
@@ -1520,7 +1555,7 @@
     <w:link w:val="Heading6"/>
     <w:uiPriority w:val="9"/>
     <w:semiHidden/>
-    <w:rsid w:val="003F6190"/>
+    <w:rsid w:val="00345911"/>
     <w:rPr>
       <w:rFonts w:eastAsiaTheme="majorEastAsia" w:cstheme="majorBidi"/>
       <w:i/>
@@ -1534,7 +1569,7 @@
     <w:link w:val="Heading7"/>
     <w:uiPriority w:val="9"/>
     <w:semiHidden/>
-    <w:rsid w:val="003F6190"/>
+    <w:rsid w:val="00345911"/>
     <w:rPr>
       <w:rFonts w:eastAsiaTheme="majorEastAsia" w:cstheme="majorBidi"/>
       <w:color w:val="595959" w:themeColor="text1" w:themeTint="A6"/>
@@ -1546,7 +1581,7 @@
     <w:link w:val="Heading8"/>
     <w:uiPriority w:val="9"/>
     <w:semiHidden/>
-    <w:rsid w:val="003F6190"/>
+    <w:rsid w:val="00345911"/>
     <w:rPr>
       <w:rFonts w:eastAsiaTheme="majorEastAsia" w:cstheme="majorBidi"/>
       <w:i/>
@@ -1560,7 +1595,7 @@
     <w:link w:val="Heading9"/>
     <w:uiPriority w:val="9"/>
     <w:semiHidden/>
-    <w:rsid w:val="003F6190"/>
+    <w:rsid w:val="00345911"/>
     <w:rPr>
       <w:rFonts w:eastAsiaTheme="majorEastAsia" w:cstheme="majorBidi"/>
       <w:color w:val="272727" w:themeColor="text1" w:themeTint="D8"/>
@@ -1573,7 +1608,7 @@
     <w:link w:val="TitleChar"/>
     <w:uiPriority w:val="10"/>
     <w:qFormat/>
-    <w:rsid w:val="003F6190"/>
+    <w:rsid w:val="00345911"/>
     <w:pPr>
       <w:spacing w:after="80" w:line="240" w:lineRule="auto"/>
       <w:contextualSpacing/>
@@ -1591,7 +1626,7 @@
     <w:basedOn w:val="DefaultParagraphFont"/>
     <w:link w:val="Title"/>
     <w:uiPriority w:val="10"/>
-    <w:rsid w:val="003F6190"/>
+    <w:rsid w:val="00345911"/>
     <w:rPr>
       <w:rFonts w:asciiTheme="majorHAnsi" w:eastAsiaTheme="majorEastAsia" w:hAnsiTheme="majorHAnsi" w:cstheme="majorBidi"/>
       <w:spacing w:val="-10"/>
@@ -1607,7 +1642,7 @@
     <w:link w:val="SubtitleChar"/>
     <w:uiPriority w:val="11"/>
     <w:qFormat/>
-    <w:rsid w:val="003F6190"/>
+    <w:rsid w:val="00345911"/>
     <w:pPr>
       <w:numPr>
         <w:ilvl w:val="1"/>
@@ -1626,7 +1661,7 @@
     <w:basedOn w:val="DefaultParagraphFont"/>
     <w:link w:val="Subtitle"/>
     <w:uiPriority w:val="11"/>
-    <w:rsid w:val="003F6190"/>
+    <w:rsid w:val="00345911"/>
     <w:rPr>
       <w:rFonts w:eastAsiaTheme="majorEastAsia" w:cstheme="majorBidi"/>
       <w:color w:val="595959" w:themeColor="text1" w:themeTint="A6"/>
@@ -1642,7 +1677,7 @@
     <w:link w:val="QuoteChar"/>
     <w:uiPriority w:val="29"/>
     <w:qFormat/>
-    <w:rsid w:val="003F6190"/>
+    <w:rsid w:val="00345911"/>
     <w:pPr>
       <w:spacing w:before="160"/>
       <w:jc w:val="center"/>
@@ -1658,7 +1693,7 @@
     <w:basedOn w:val="DefaultParagraphFont"/>
     <w:link w:val="Quote"/>
     <w:uiPriority w:val="29"/>
-    <w:rsid w:val="003F6190"/>
+    <w:rsid w:val="00345911"/>
     <w:rPr>
       <w:i/>
       <w:iCs/>
@@ -1670,7 +1705,7 @@
     <w:basedOn w:val="Normal"/>
     <w:uiPriority w:val="34"/>
     <w:qFormat/>
-    <w:rsid w:val="003F6190"/>
+    <w:rsid w:val="00345911"/>
     <w:pPr>
       <w:ind w:left="720"/>
       <w:contextualSpacing/>
@@ -1681,7 +1716,7 @@
     <w:basedOn w:val="DefaultParagraphFont"/>
     <w:uiPriority w:val="21"/>
     <w:qFormat/>
-    <w:rsid w:val="003F6190"/>
+    <w:rsid w:val="00345911"/>
     <w:rPr>
       <w:i/>
       <w:iCs/>
@@ -1695,7 +1730,7 @@
     <w:link w:val="IntenseQuoteChar"/>
     <w:uiPriority w:val="30"/>
     <w:qFormat/>
-    <w:rsid w:val="003F6190"/>
+    <w:rsid w:val="00345911"/>
     <w:pPr>
       <w:pBdr>
         <w:top w:val="single" w:sz="4" w:space="10" w:color="0F4761" w:themeColor="accent1" w:themeShade="BF"/>
@@ -1716,7 +1751,7 @@
     <w:basedOn w:val="DefaultParagraphFont"/>
     <w:link w:val="IntenseQuote"/>
     <w:uiPriority w:val="30"/>
-    <w:rsid w:val="003F6190"/>
+    <w:rsid w:val="00345911"/>
     <w:rPr>
       <w:i/>
       <w:iCs/>
@@ -1728,7 +1763,7 @@
     <w:basedOn w:val="DefaultParagraphFont"/>
     <w:uiPriority w:val="32"/>
     <w:qFormat/>
-    <w:rsid w:val="003F6190"/>
+    <w:rsid w:val="00345911"/>
     <w:rPr>
       <w:b/>
       <w:bCs/>
@@ -1742,7 +1777,7 @@
     <w:basedOn w:val="Normal"/>
     <w:uiPriority w:val="99"/>
     <w:unhideWhenUsed/>
-    <w:rsid w:val="003F6190"/>
+    <w:rsid w:val="00345911"/>
     <w:pPr>
       <w:numPr>
         <w:numId w:val="1"/>

</xml_diff>

<commit_message>
Manuals: mu-Clid MIDI screenshots refreshed (3 images, from the mu-clid-midi-shot harness), manual regenerated
Co-Authored-By: Claude Sonnet 5.5 <noreply@anthropic.com>
</commit_message>
<xml_diff>
--- a/docs/mu-clid-midi/mu-Clid MIDI User Manual.docx
+++ b/docs/mu-clid-midi/mu-Clid MIDI User Manual.docx
@@ -76,10 +76,10 @@
           <w:noProof/>
         </w:rPr>
         <w:drawing>
-          <wp:inline distT="0" distB="0" distL="0" distR="0" wp14:anchorId="129A3983" wp14:editId="540A43C6">
+          <wp:inline distT="0" distB="0" distL="0" distR="0" wp14:anchorId="201B053C" wp14:editId="18A911B7">
             <wp:extent cx="5274310" cy="1995805"/>
             <wp:effectExtent l="0" t="0" r="2540" b="4445"/>
-            <wp:docPr id="1492215828" name="Picture 1"/>
+            <wp:docPr id="349488242" name="Picture 1"/>
             <wp:cNvGraphicFramePr>
               <a:graphicFrameLocks xmlns:a="http://schemas.openxmlformats.org/drawingml/2006/main" noChangeAspect="1"/>
             </wp:cNvGraphicFramePr>
@@ -87,7 +87,7 @@
               <a:graphicData uri="http://schemas.openxmlformats.org/drawingml/2006/picture">
                 <pic:pic xmlns:pic="http://schemas.openxmlformats.org/drawingml/2006/picture">
                   <pic:nvPicPr>
-                    <pic:cNvPr id="1492215828" name=""/>
+                    <pic:cNvPr id="349488242" name=""/>
                     <pic:cNvPicPr/>
                   </pic:nvPicPr>
                   <pic:blipFill>
@@ -283,10 +283,10 @@
           <w:noProof/>
         </w:rPr>
         <w:drawing>
-          <wp:inline distT="0" distB="0" distL="0" distR="0" wp14:anchorId="6A9082D3" wp14:editId="151DED23">
+          <wp:inline distT="0" distB="0" distL="0" distR="0" wp14:anchorId="1B04DFF1" wp14:editId="78D6AE76">
             <wp:extent cx="5274310" cy="189865"/>
             <wp:effectExtent l="0" t="0" r="2540" b="635"/>
-            <wp:docPr id="720026439" name="Picture 2"/>
+            <wp:docPr id="844593609" name="Picture 2"/>
             <wp:cNvGraphicFramePr>
               <a:graphicFrameLocks xmlns:a="http://schemas.openxmlformats.org/drawingml/2006/main" noChangeAspect="1"/>
             </wp:cNvGraphicFramePr>
@@ -294,7 +294,7 @@
               <a:graphicData uri="http://schemas.openxmlformats.org/drawingml/2006/picture">
                 <pic:pic xmlns:pic="http://schemas.openxmlformats.org/drawingml/2006/picture">
                   <pic:nvPicPr>
-                    <pic:cNvPr id="720026439" name=""/>
+                    <pic:cNvPr id="844593609" name=""/>
                     <pic:cNvPicPr/>
                   </pic:nvPicPr>
                   <pic:blipFill>
@@ -653,10 +653,10 @@
           <w:noProof/>
         </w:rPr>
         <w:drawing>
-          <wp:inline distT="0" distB="0" distL="0" distR="0" wp14:anchorId="6E20B577" wp14:editId="49745FB4">
+          <wp:inline distT="0" distB="0" distL="0" distR="0" wp14:anchorId="21B118DE" wp14:editId="1E46AD0F">
             <wp:extent cx="5274310" cy="1710690"/>
             <wp:effectExtent l="0" t="0" r="2540" b="3810"/>
-            <wp:docPr id="2054314169" name="Picture 3"/>
+            <wp:docPr id="977069586" name="Picture 3"/>
             <wp:cNvGraphicFramePr>
               <a:graphicFrameLocks xmlns:a="http://schemas.openxmlformats.org/drawingml/2006/main" noChangeAspect="1"/>
             </wp:cNvGraphicFramePr>
@@ -664,7 +664,7 @@
               <a:graphicData uri="http://schemas.openxmlformats.org/drawingml/2006/picture">
                 <pic:pic xmlns:pic="http://schemas.openxmlformats.org/drawingml/2006/picture">
                   <pic:nvPicPr>
-                    <pic:cNvPr id="2054314169" name=""/>
+                    <pic:cNvPr id="977069586" name=""/>
                     <pic:cNvPicPr/>
                   </pic:nvPicPr>
                   <pic:blipFill>
@@ -833,7 +833,7 @@
   <w:abstractNum w:abstractNumId="0" w15:restartNumberingAfterBreak="0">
     <w:nsid w:val="FFFFFF89"/>
     <w:multiLevelType w:val="singleLevel"/>
-    <w:tmpl w:val="0F3AA17A"/>
+    <w:tmpl w:val="F1CCAA12"/>
     <w:lvl w:ilvl="0">
       <w:start w:val="1"/>
       <w:numFmt w:val="bullet"/>
@@ -851,7 +851,7 @@
       </w:rPr>
     </w:lvl>
   </w:abstractNum>
-  <w:num w:numId="1" w16cid:durableId="500782202">
+  <w:num w:numId="1" w16cid:durableId="391779355">
     <w:abstractNumId w:val="0"/>
   </w:num>
 </w:numbering>
@@ -1265,7 +1265,7 @@
     <w:link w:val="Heading1Char"/>
     <w:uiPriority w:val="9"/>
     <w:qFormat/>
-    <w:rsid w:val="00345911"/>
+    <w:rsid w:val="0043724D"/>
     <w:pPr>
       <w:keepNext/>
       <w:keepLines/>
@@ -1287,7 +1287,7 @@
     <w:uiPriority w:val="9"/>
     <w:unhideWhenUsed/>
     <w:qFormat/>
-    <w:rsid w:val="00345911"/>
+    <w:rsid w:val="0043724D"/>
     <w:pPr>
       <w:keepNext/>
       <w:keepLines/>
@@ -1310,7 +1310,7 @@
     <w:semiHidden/>
     <w:unhideWhenUsed/>
     <w:qFormat/>
-    <w:rsid w:val="00345911"/>
+    <w:rsid w:val="0043724D"/>
     <w:pPr>
       <w:keepNext/>
       <w:keepLines/>
@@ -1333,7 +1333,7 @@
     <w:semiHidden/>
     <w:unhideWhenUsed/>
     <w:qFormat/>
-    <w:rsid w:val="00345911"/>
+    <w:rsid w:val="0043724D"/>
     <w:pPr>
       <w:keepNext/>
       <w:keepLines/>
@@ -1356,7 +1356,7 @@
     <w:semiHidden/>
     <w:unhideWhenUsed/>
     <w:qFormat/>
-    <w:rsid w:val="00345911"/>
+    <w:rsid w:val="0043724D"/>
     <w:pPr>
       <w:keepNext/>
       <w:keepLines/>
@@ -1377,7 +1377,7 @@
     <w:semiHidden/>
     <w:unhideWhenUsed/>
     <w:qFormat/>
-    <w:rsid w:val="00345911"/>
+    <w:rsid w:val="0043724D"/>
     <w:pPr>
       <w:keepNext/>
       <w:keepLines/>
@@ -1400,7 +1400,7 @@
     <w:semiHidden/>
     <w:unhideWhenUsed/>
     <w:qFormat/>
-    <w:rsid w:val="00345911"/>
+    <w:rsid w:val="0043724D"/>
     <w:pPr>
       <w:keepNext/>
       <w:keepLines/>
@@ -1421,7 +1421,7 @@
     <w:semiHidden/>
     <w:unhideWhenUsed/>
     <w:qFormat/>
-    <w:rsid w:val="00345911"/>
+    <w:rsid w:val="0043724D"/>
     <w:pPr>
       <w:keepNext/>
       <w:keepLines/>
@@ -1444,7 +1444,7 @@
     <w:semiHidden/>
     <w:unhideWhenUsed/>
     <w:qFormat/>
-    <w:rsid w:val="00345911"/>
+    <w:rsid w:val="0043724D"/>
     <w:pPr>
       <w:keepNext/>
       <w:keepLines/>
@@ -1488,7 +1488,7 @@
     <w:basedOn w:val="DefaultParagraphFont"/>
     <w:link w:val="Heading1"/>
     <w:uiPriority w:val="9"/>
-    <w:rsid w:val="00345911"/>
+    <w:rsid w:val="0043724D"/>
     <w:rPr>
       <w:rFonts w:asciiTheme="majorHAnsi" w:eastAsiaTheme="majorEastAsia" w:hAnsiTheme="majorHAnsi" w:cstheme="majorBidi"/>
       <w:color w:val="0F4761" w:themeColor="accent1" w:themeShade="BF"/>
@@ -1501,7 +1501,7 @@
     <w:basedOn w:val="DefaultParagraphFont"/>
     <w:link w:val="Heading2"/>
     <w:uiPriority w:val="9"/>
-    <w:rsid w:val="00345911"/>
+    <w:rsid w:val="0043724D"/>
     <w:rPr>
       <w:rFonts w:asciiTheme="majorHAnsi" w:eastAsiaTheme="majorEastAsia" w:hAnsiTheme="majorHAnsi" w:cstheme="majorBidi"/>
       <w:color w:val="0F4761" w:themeColor="accent1" w:themeShade="BF"/>
@@ -1515,7 +1515,7 @@
     <w:link w:val="Heading3"/>
     <w:uiPriority w:val="9"/>
     <w:semiHidden/>
-    <w:rsid w:val="00345911"/>
+    <w:rsid w:val="0043724D"/>
     <w:rPr>
       <w:rFonts w:eastAsiaTheme="majorEastAsia" w:cstheme="majorBidi"/>
       <w:color w:val="0F4761" w:themeColor="accent1" w:themeShade="BF"/>
@@ -1529,7 +1529,7 @@
     <w:link w:val="Heading4"/>
     <w:uiPriority w:val="9"/>
     <w:semiHidden/>
-    <w:rsid w:val="00345911"/>
+    <w:rsid w:val="0043724D"/>
     <w:rPr>
       <w:rFonts w:eastAsiaTheme="majorEastAsia" w:cstheme="majorBidi"/>
       <w:i/>
@@ -1543,7 +1543,7 @@
     <w:link w:val="Heading5"/>
     <w:uiPriority w:val="9"/>
     <w:semiHidden/>
-    <w:rsid w:val="00345911"/>
+    <w:rsid w:val="0043724D"/>
     <w:rPr>
       <w:rFonts w:eastAsiaTheme="majorEastAsia" w:cstheme="majorBidi"/>
       <w:color w:val="0F4761" w:themeColor="accent1" w:themeShade="BF"/>
@@ -1555,7 +1555,7 @@
     <w:link w:val="Heading6"/>
     <w:uiPriority w:val="9"/>
     <w:semiHidden/>
-    <w:rsid w:val="00345911"/>
+    <w:rsid w:val="0043724D"/>
     <w:rPr>
       <w:rFonts w:eastAsiaTheme="majorEastAsia" w:cstheme="majorBidi"/>
       <w:i/>
@@ -1569,7 +1569,7 @@
     <w:link w:val="Heading7"/>
     <w:uiPriority w:val="9"/>
     <w:semiHidden/>
-    <w:rsid w:val="00345911"/>
+    <w:rsid w:val="0043724D"/>
     <w:rPr>
       <w:rFonts w:eastAsiaTheme="majorEastAsia" w:cstheme="majorBidi"/>
       <w:color w:val="595959" w:themeColor="text1" w:themeTint="A6"/>
@@ -1581,7 +1581,7 @@
     <w:link w:val="Heading8"/>
     <w:uiPriority w:val="9"/>
     <w:semiHidden/>
-    <w:rsid w:val="00345911"/>
+    <w:rsid w:val="0043724D"/>
     <w:rPr>
       <w:rFonts w:eastAsiaTheme="majorEastAsia" w:cstheme="majorBidi"/>
       <w:i/>
@@ -1595,7 +1595,7 @@
     <w:link w:val="Heading9"/>
     <w:uiPriority w:val="9"/>
     <w:semiHidden/>
-    <w:rsid w:val="00345911"/>
+    <w:rsid w:val="0043724D"/>
     <w:rPr>
       <w:rFonts w:eastAsiaTheme="majorEastAsia" w:cstheme="majorBidi"/>
       <w:color w:val="272727" w:themeColor="text1" w:themeTint="D8"/>
@@ -1608,7 +1608,7 @@
     <w:link w:val="TitleChar"/>
     <w:uiPriority w:val="10"/>
     <w:qFormat/>
-    <w:rsid w:val="00345911"/>
+    <w:rsid w:val="0043724D"/>
     <w:pPr>
       <w:spacing w:after="80" w:line="240" w:lineRule="auto"/>
       <w:contextualSpacing/>
@@ -1626,7 +1626,7 @@
     <w:basedOn w:val="DefaultParagraphFont"/>
     <w:link w:val="Title"/>
     <w:uiPriority w:val="10"/>
-    <w:rsid w:val="00345911"/>
+    <w:rsid w:val="0043724D"/>
     <w:rPr>
       <w:rFonts w:asciiTheme="majorHAnsi" w:eastAsiaTheme="majorEastAsia" w:hAnsiTheme="majorHAnsi" w:cstheme="majorBidi"/>
       <w:spacing w:val="-10"/>
@@ -1642,7 +1642,7 @@
     <w:link w:val="SubtitleChar"/>
     <w:uiPriority w:val="11"/>
     <w:qFormat/>
-    <w:rsid w:val="00345911"/>
+    <w:rsid w:val="0043724D"/>
     <w:pPr>
       <w:numPr>
         <w:ilvl w:val="1"/>
@@ -1661,7 +1661,7 @@
     <w:basedOn w:val="DefaultParagraphFont"/>
     <w:link w:val="Subtitle"/>
     <w:uiPriority w:val="11"/>
-    <w:rsid w:val="00345911"/>
+    <w:rsid w:val="0043724D"/>
     <w:rPr>
       <w:rFonts w:eastAsiaTheme="majorEastAsia" w:cstheme="majorBidi"/>
       <w:color w:val="595959" w:themeColor="text1" w:themeTint="A6"/>
@@ -1677,7 +1677,7 @@
     <w:link w:val="QuoteChar"/>
     <w:uiPriority w:val="29"/>
     <w:qFormat/>
-    <w:rsid w:val="00345911"/>
+    <w:rsid w:val="0043724D"/>
     <w:pPr>
       <w:spacing w:before="160"/>
       <w:jc w:val="center"/>
@@ -1693,7 +1693,7 @@
     <w:basedOn w:val="DefaultParagraphFont"/>
     <w:link w:val="Quote"/>
     <w:uiPriority w:val="29"/>
-    <w:rsid w:val="00345911"/>
+    <w:rsid w:val="0043724D"/>
     <w:rPr>
       <w:i/>
       <w:iCs/>
@@ -1705,7 +1705,7 @@
     <w:basedOn w:val="Normal"/>
     <w:uiPriority w:val="34"/>
     <w:qFormat/>
-    <w:rsid w:val="00345911"/>
+    <w:rsid w:val="0043724D"/>
     <w:pPr>
       <w:ind w:left="720"/>
       <w:contextualSpacing/>
@@ -1716,7 +1716,7 @@
     <w:basedOn w:val="DefaultParagraphFont"/>
     <w:uiPriority w:val="21"/>
     <w:qFormat/>
-    <w:rsid w:val="00345911"/>
+    <w:rsid w:val="0043724D"/>
     <w:rPr>
       <w:i/>
       <w:iCs/>
@@ -1730,7 +1730,7 @@
     <w:link w:val="IntenseQuoteChar"/>
     <w:uiPriority w:val="30"/>
     <w:qFormat/>
-    <w:rsid w:val="00345911"/>
+    <w:rsid w:val="0043724D"/>
     <w:pPr>
       <w:pBdr>
         <w:top w:val="single" w:sz="4" w:space="10" w:color="0F4761" w:themeColor="accent1" w:themeShade="BF"/>
@@ -1751,7 +1751,7 @@
     <w:basedOn w:val="DefaultParagraphFont"/>
     <w:link w:val="IntenseQuote"/>
     <w:uiPriority w:val="30"/>
-    <w:rsid w:val="00345911"/>
+    <w:rsid w:val="0043724D"/>
     <w:rPr>
       <w:i/>
       <w:iCs/>
@@ -1763,7 +1763,7 @@
     <w:basedOn w:val="DefaultParagraphFont"/>
     <w:uiPriority w:val="32"/>
     <w:qFormat/>
-    <w:rsid w:val="00345911"/>
+    <w:rsid w:val="0043724D"/>
     <w:rPr>
       <w:b/>
       <w:bCs/>
@@ -1777,7 +1777,7 @@
     <w:basedOn w:val="Normal"/>
     <w:uiPriority w:val="99"/>
     <w:unhideWhenUsed/>
-    <w:rsid w:val="00345911"/>
+    <w:rsid w:val="0043724D"/>
     <w:pPr>
       <w:numPr>
         <w:numId w:val="1"/>

</xml_diff>

<commit_message>
Manuals: mu-Clid MIDI screenshots re-rendered from a harness rebuilt at v1.1.0.1450, manual regenerated
Co-Authored-By: Claude Sonnet 5.5 <noreply@anthropic.com>
</commit_message>
<xml_diff>
--- a/docs/mu-clid-midi/mu-Clid MIDI User Manual.docx
+++ b/docs/mu-clid-midi/mu-Clid MIDI User Manual.docx
@@ -76,10 +76,10 @@
           <w:noProof/>
         </w:rPr>
         <w:drawing>
-          <wp:inline distT="0" distB="0" distL="0" distR="0" wp14:anchorId="201B053C" wp14:editId="18A911B7">
+          <wp:inline distT="0" distB="0" distL="0" distR="0" wp14:anchorId="502E3727" wp14:editId="0F2AA21E">
             <wp:extent cx="5274310" cy="1995805"/>
             <wp:effectExtent l="0" t="0" r="2540" b="4445"/>
-            <wp:docPr id="349488242" name="Picture 1"/>
+            <wp:docPr id="1021348798" name="Picture 1"/>
             <wp:cNvGraphicFramePr>
               <a:graphicFrameLocks xmlns:a="http://schemas.openxmlformats.org/drawingml/2006/main" noChangeAspect="1"/>
             </wp:cNvGraphicFramePr>
@@ -87,7 +87,7 @@
               <a:graphicData uri="http://schemas.openxmlformats.org/drawingml/2006/picture">
                 <pic:pic xmlns:pic="http://schemas.openxmlformats.org/drawingml/2006/picture">
                   <pic:nvPicPr>
-                    <pic:cNvPr id="349488242" name=""/>
+                    <pic:cNvPr id="1021348798" name=""/>
                     <pic:cNvPicPr/>
                   </pic:nvPicPr>
                   <pic:blipFill>
@@ -283,10 +283,10 @@
           <w:noProof/>
         </w:rPr>
         <w:drawing>
-          <wp:inline distT="0" distB="0" distL="0" distR="0" wp14:anchorId="1B04DFF1" wp14:editId="78D6AE76">
+          <wp:inline distT="0" distB="0" distL="0" distR="0" wp14:anchorId="087926A8" wp14:editId="0BB85D6A">
             <wp:extent cx="5274310" cy="189865"/>
             <wp:effectExtent l="0" t="0" r="2540" b="635"/>
-            <wp:docPr id="844593609" name="Picture 2"/>
+            <wp:docPr id="1773655276" name="Picture 2"/>
             <wp:cNvGraphicFramePr>
               <a:graphicFrameLocks xmlns:a="http://schemas.openxmlformats.org/drawingml/2006/main" noChangeAspect="1"/>
             </wp:cNvGraphicFramePr>
@@ -294,7 +294,7 @@
               <a:graphicData uri="http://schemas.openxmlformats.org/drawingml/2006/picture">
                 <pic:pic xmlns:pic="http://schemas.openxmlformats.org/drawingml/2006/picture">
                   <pic:nvPicPr>
-                    <pic:cNvPr id="844593609" name=""/>
+                    <pic:cNvPr id="1773655276" name=""/>
                     <pic:cNvPicPr/>
                   </pic:nvPicPr>
                   <pic:blipFill>
@@ -653,10 +653,10 @@
           <w:noProof/>
         </w:rPr>
         <w:drawing>
-          <wp:inline distT="0" distB="0" distL="0" distR="0" wp14:anchorId="21B118DE" wp14:editId="1E46AD0F">
+          <wp:inline distT="0" distB="0" distL="0" distR="0" wp14:anchorId="599BE002" wp14:editId="225A150B">
             <wp:extent cx="5274310" cy="1710690"/>
             <wp:effectExtent l="0" t="0" r="2540" b="3810"/>
-            <wp:docPr id="977069586" name="Picture 3"/>
+            <wp:docPr id="708075308" name="Picture 3"/>
             <wp:cNvGraphicFramePr>
               <a:graphicFrameLocks xmlns:a="http://schemas.openxmlformats.org/drawingml/2006/main" noChangeAspect="1"/>
             </wp:cNvGraphicFramePr>
@@ -664,7 +664,7 @@
               <a:graphicData uri="http://schemas.openxmlformats.org/drawingml/2006/picture">
                 <pic:pic xmlns:pic="http://schemas.openxmlformats.org/drawingml/2006/picture">
                   <pic:nvPicPr>
-                    <pic:cNvPr id="977069586" name=""/>
+                    <pic:cNvPr id="708075308" name=""/>
                     <pic:cNvPicPr/>
                   </pic:nvPicPr>
                   <pic:blipFill>
@@ -833,7 +833,7 @@
   <w:abstractNum w:abstractNumId="0" w15:restartNumberingAfterBreak="0">
     <w:nsid w:val="FFFFFF89"/>
     <w:multiLevelType w:val="singleLevel"/>
-    <w:tmpl w:val="F1CCAA12"/>
+    <w:tmpl w:val="FA4011A6"/>
     <w:lvl w:ilvl="0">
       <w:start w:val="1"/>
       <w:numFmt w:val="bullet"/>
@@ -851,7 +851,7 @@
       </w:rPr>
     </w:lvl>
   </w:abstractNum>
-  <w:num w:numId="1" w16cid:durableId="391779355">
+  <w:num w:numId="1" w16cid:durableId="387461055">
     <w:abstractNumId w:val="0"/>
   </w:num>
 </w:numbering>
@@ -1265,7 +1265,7 @@
     <w:link w:val="Heading1Char"/>
     <w:uiPriority w:val="9"/>
     <w:qFormat/>
-    <w:rsid w:val="0043724D"/>
+    <w:rsid w:val="00A75A92"/>
     <w:pPr>
       <w:keepNext/>
       <w:keepLines/>
@@ -1287,7 +1287,7 @@
     <w:uiPriority w:val="9"/>
     <w:unhideWhenUsed/>
     <w:qFormat/>
-    <w:rsid w:val="0043724D"/>
+    <w:rsid w:val="00A75A92"/>
     <w:pPr>
       <w:keepNext/>
       <w:keepLines/>
@@ -1310,7 +1310,7 @@
     <w:semiHidden/>
     <w:unhideWhenUsed/>
     <w:qFormat/>
-    <w:rsid w:val="0043724D"/>
+    <w:rsid w:val="00A75A92"/>
     <w:pPr>
       <w:keepNext/>
       <w:keepLines/>
@@ -1333,7 +1333,7 @@
     <w:semiHidden/>
     <w:unhideWhenUsed/>
     <w:qFormat/>
-    <w:rsid w:val="0043724D"/>
+    <w:rsid w:val="00A75A92"/>
     <w:pPr>
       <w:keepNext/>
       <w:keepLines/>
@@ -1356,7 +1356,7 @@
     <w:semiHidden/>
     <w:unhideWhenUsed/>
     <w:qFormat/>
-    <w:rsid w:val="0043724D"/>
+    <w:rsid w:val="00A75A92"/>
     <w:pPr>
       <w:keepNext/>
       <w:keepLines/>
@@ -1377,7 +1377,7 @@
     <w:semiHidden/>
     <w:unhideWhenUsed/>
     <w:qFormat/>
-    <w:rsid w:val="0043724D"/>
+    <w:rsid w:val="00A75A92"/>
     <w:pPr>
       <w:keepNext/>
       <w:keepLines/>
@@ -1400,7 +1400,7 @@
     <w:semiHidden/>
     <w:unhideWhenUsed/>
     <w:qFormat/>
-    <w:rsid w:val="0043724D"/>
+    <w:rsid w:val="00A75A92"/>
     <w:pPr>
       <w:keepNext/>
       <w:keepLines/>
@@ -1421,7 +1421,7 @@
     <w:semiHidden/>
     <w:unhideWhenUsed/>
     <w:qFormat/>
-    <w:rsid w:val="0043724D"/>
+    <w:rsid w:val="00A75A92"/>
     <w:pPr>
       <w:keepNext/>
       <w:keepLines/>
@@ -1444,7 +1444,7 @@
     <w:semiHidden/>
     <w:unhideWhenUsed/>
     <w:qFormat/>
-    <w:rsid w:val="0043724D"/>
+    <w:rsid w:val="00A75A92"/>
     <w:pPr>
       <w:keepNext/>
       <w:keepLines/>
@@ -1488,7 +1488,7 @@
     <w:basedOn w:val="DefaultParagraphFont"/>
     <w:link w:val="Heading1"/>
     <w:uiPriority w:val="9"/>
-    <w:rsid w:val="0043724D"/>
+    <w:rsid w:val="00A75A92"/>
     <w:rPr>
       <w:rFonts w:asciiTheme="majorHAnsi" w:eastAsiaTheme="majorEastAsia" w:hAnsiTheme="majorHAnsi" w:cstheme="majorBidi"/>
       <w:color w:val="0F4761" w:themeColor="accent1" w:themeShade="BF"/>
@@ -1501,7 +1501,7 @@
     <w:basedOn w:val="DefaultParagraphFont"/>
     <w:link w:val="Heading2"/>
     <w:uiPriority w:val="9"/>
-    <w:rsid w:val="0043724D"/>
+    <w:rsid w:val="00A75A92"/>
     <w:rPr>
       <w:rFonts w:asciiTheme="majorHAnsi" w:eastAsiaTheme="majorEastAsia" w:hAnsiTheme="majorHAnsi" w:cstheme="majorBidi"/>
       <w:color w:val="0F4761" w:themeColor="accent1" w:themeShade="BF"/>
@@ -1515,7 +1515,7 @@
     <w:link w:val="Heading3"/>
     <w:uiPriority w:val="9"/>
     <w:semiHidden/>
-    <w:rsid w:val="0043724D"/>
+    <w:rsid w:val="00A75A92"/>
     <w:rPr>
       <w:rFonts w:eastAsiaTheme="majorEastAsia" w:cstheme="majorBidi"/>
       <w:color w:val="0F4761" w:themeColor="accent1" w:themeShade="BF"/>
@@ -1529,7 +1529,7 @@
     <w:link w:val="Heading4"/>
     <w:uiPriority w:val="9"/>
     <w:semiHidden/>
-    <w:rsid w:val="0043724D"/>
+    <w:rsid w:val="00A75A92"/>
     <w:rPr>
       <w:rFonts w:eastAsiaTheme="majorEastAsia" w:cstheme="majorBidi"/>
       <w:i/>
@@ -1543,7 +1543,7 @@
     <w:link w:val="Heading5"/>
     <w:uiPriority w:val="9"/>
     <w:semiHidden/>
-    <w:rsid w:val="0043724D"/>
+    <w:rsid w:val="00A75A92"/>
     <w:rPr>
       <w:rFonts w:eastAsiaTheme="majorEastAsia" w:cstheme="majorBidi"/>
       <w:color w:val="0F4761" w:themeColor="accent1" w:themeShade="BF"/>
@@ -1555,7 +1555,7 @@
     <w:link w:val="Heading6"/>
     <w:uiPriority w:val="9"/>
     <w:semiHidden/>
-    <w:rsid w:val="0043724D"/>
+    <w:rsid w:val="00A75A92"/>
     <w:rPr>
       <w:rFonts w:eastAsiaTheme="majorEastAsia" w:cstheme="majorBidi"/>
       <w:i/>
@@ -1569,7 +1569,7 @@
     <w:link w:val="Heading7"/>
     <w:uiPriority w:val="9"/>
     <w:semiHidden/>
-    <w:rsid w:val="0043724D"/>
+    <w:rsid w:val="00A75A92"/>
     <w:rPr>
       <w:rFonts w:eastAsiaTheme="majorEastAsia" w:cstheme="majorBidi"/>
       <w:color w:val="595959" w:themeColor="text1" w:themeTint="A6"/>
@@ -1581,7 +1581,7 @@
     <w:link w:val="Heading8"/>
     <w:uiPriority w:val="9"/>
     <w:semiHidden/>
-    <w:rsid w:val="0043724D"/>
+    <w:rsid w:val="00A75A92"/>
     <w:rPr>
       <w:rFonts w:eastAsiaTheme="majorEastAsia" w:cstheme="majorBidi"/>
       <w:i/>
@@ -1595,7 +1595,7 @@
     <w:link w:val="Heading9"/>
     <w:uiPriority w:val="9"/>
     <w:semiHidden/>
-    <w:rsid w:val="0043724D"/>
+    <w:rsid w:val="00A75A92"/>
     <w:rPr>
       <w:rFonts w:eastAsiaTheme="majorEastAsia" w:cstheme="majorBidi"/>
       <w:color w:val="272727" w:themeColor="text1" w:themeTint="D8"/>
@@ -1608,7 +1608,7 @@
     <w:link w:val="TitleChar"/>
     <w:uiPriority w:val="10"/>
     <w:qFormat/>
-    <w:rsid w:val="0043724D"/>
+    <w:rsid w:val="00A75A92"/>
     <w:pPr>
       <w:spacing w:after="80" w:line="240" w:lineRule="auto"/>
       <w:contextualSpacing/>
@@ -1626,7 +1626,7 @@
     <w:basedOn w:val="DefaultParagraphFont"/>
     <w:link w:val="Title"/>
     <w:uiPriority w:val="10"/>
-    <w:rsid w:val="0043724D"/>
+    <w:rsid w:val="00A75A92"/>
     <w:rPr>
       <w:rFonts w:asciiTheme="majorHAnsi" w:eastAsiaTheme="majorEastAsia" w:hAnsiTheme="majorHAnsi" w:cstheme="majorBidi"/>
       <w:spacing w:val="-10"/>
@@ -1642,7 +1642,7 @@
     <w:link w:val="SubtitleChar"/>
     <w:uiPriority w:val="11"/>
     <w:qFormat/>
-    <w:rsid w:val="0043724D"/>
+    <w:rsid w:val="00A75A92"/>
     <w:pPr>
       <w:numPr>
         <w:ilvl w:val="1"/>
@@ -1661,7 +1661,7 @@
     <w:basedOn w:val="DefaultParagraphFont"/>
     <w:link w:val="Subtitle"/>
     <w:uiPriority w:val="11"/>
-    <w:rsid w:val="0043724D"/>
+    <w:rsid w:val="00A75A92"/>
     <w:rPr>
       <w:rFonts w:eastAsiaTheme="majorEastAsia" w:cstheme="majorBidi"/>
       <w:color w:val="595959" w:themeColor="text1" w:themeTint="A6"/>
@@ -1677,7 +1677,7 @@
     <w:link w:val="QuoteChar"/>
     <w:uiPriority w:val="29"/>
     <w:qFormat/>
-    <w:rsid w:val="0043724D"/>
+    <w:rsid w:val="00A75A92"/>
     <w:pPr>
       <w:spacing w:before="160"/>
       <w:jc w:val="center"/>
@@ -1693,7 +1693,7 @@
     <w:basedOn w:val="DefaultParagraphFont"/>
     <w:link w:val="Quote"/>
     <w:uiPriority w:val="29"/>
-    <w:rsid w:val="0043724D"/>
+    <w:rsid w:val="00A75A92"/>
     <w:rPr>
       <w:i/>
       <w:iCs/>
@@ -1705,7 +1705,7 @@
     <w:basedOn w:val="Normal"/>
     <w:uiPriority w:val="34"/>
     <w:qFormat/>
-    <w:rsid w:val="0043724D"/>
+    <w:rsid w:val="00A75A92"/>
     <w:pPr>
       <w:ind w:left="720"/>
       <w:contextualSpacing/>
@@ -1716,7 +1716,7 @@
     <w:basedOn w:val="DefaultParagraphFont"/>
     <w:uiPriority w:val="21"/>
     <w:qFormat/>
-    <w:rsid w:val="0043724D"/>
+    <w:rsid w:val="00A75A92"/>
     <w:rPr>
       <w:i/>
       <w:iCs/>
@@ -1730,7 +1730,7 @@
     <w:link w:val="IntenseQuoteChar"/>
     <w:uiPriority w:val="30"/>
     <w:qFormat/>
-    <w:rsid w:val="0043724D"/>
+    <w:rsid w:val="00A75A92"/>
     <w:pPr>
       <w:pBdr>
         <w:top w:val="single" w:sz="4" w:space="10" w:color="0F4761" w:themeColor="accent1" w:themeShade="BF"/>
@@ -1751,7 +1751,7 @@
     <w:basedOn w:val="DefaultParagraphFont"/>
     <w:link w:val="IntenseQuote"/>
     <w:uiPriority w:val="30"/>
-    <w:rsid w:val="0043724D"/>
+    <w:rsid w:val="00A75A92"/>
     <w:rPr>
       <w:i/>
       <w:iCs/>
@@ -1763,7 +1763,7 @@
     <w:basedOn w:val="DefaultParagraphFont"/>
     <w:uiPriority w:val="32"/>
     <w:qFormat/>
-    <w:rsid w:val="0043724D"/>
+    <w:rsid w:val="00A75A92"/>
     <w:rPr>
       <w:b/>
       <w:bCs/>
@@ -1777,7 +1777,7 @@
     <w:basedOn w:val="Normal"/>
     <w:uiPriority w:val="99"/>
     <w:unhideWhenUsed/>
-    <w:rsid w:val="0043724D"/>
+    <w:rsid w:val="00A75A92"/>
     <w:pPr>
       <w:numPr>
         <w:numId w:val="1"/>

</xml_diff>